<commit_message>
Paper docx: 11 figures embedded (convergence, scaling, profiles, Ghia, voxel)
</commit_message>
<xml_diff>
--- a/solver_LBM_steady_state/SCMK_LBM_Paper_KR.docx
+++ b/solver_LBM_steady_state/SCMK_LBM_Paper_KR.docx
@@ -2292,7 +2292,331 @@
           <w:i/>
           <w:sz w:val="18"/>
         </w:rPr>
-        <w:t>¹ 기본 LBM은 200,000 스텝 한도 내 수렴 실패; SCMK는 정상 수렴.</w:t>
+        <w:t>¹ 기본 LBM은 200,000 스텝 한도 내 수렴 실증.</w:t>
+      </w:r>
+    </w:p>
+    <w:p>
+      <w:pPr>
+        <w:spacing w:before="160" w:after="40"/>
+        <w:jc w:val="center"/>
+      </w:pPr>
+      <w:r>
+        <w:drawing>
+          <wp:inline xmlns:a="http://schemas.openxmlformats.org/drawingml/2006/main" xmlns:pic="http://schemas.openxmlformats.org/drawingml/2006/picture">
+            <wp:extent cx="5486400" cy="3918857"/>
+            <wp:docPr id="1" name="Picture 1"/>
+            <wp:cNvGraphicFramePr>
+              <a:graphicFrameLocks noChangeAspect="1"/>
+            </wp:cNvGraphicFramePr>
+            <a:graphic>
+              <a:graphicData uri="http://schemas.openxmlformats.org/drawingml/2006/picture">
+                <pic:pic>
+                  <pic:nvPicPr>
+                    <pic:cNvPr id="0" name="convergence.png"/>
+                    <pic:cNvPicPr/>
+                  </pic:nvPicPr>
+                  <pic:blipFill>
+                    <a:blip r:embed="rId9"/>
+                    <a:stretch>
+                      <a:fillRect/>
+                    </a:stretch>
+                  </pic:blipFill>
+                  <pic:spPr>
+                    <a:xfrm>
+                      <a:off x="0" y="0"/>
+                      <a:ext cx="5486400" cy="3918857"/>
+                    </a:xfrm>
+                    <a:prstGeom prst="rect"/>
+                  </pic:spPr>
+                </pic:pic>
+              </a:graphicData>
+            </a:graphic>
+          </wp:inline>
+        </w:drawing>
+      </w:r>
+    </w:p>
+    <w:p>
+      <w:pPr>
+        <w:spacing w:after="200"/>
+        <w:jc w:val="center"/>
+      </w:pPr>
+      <w:r>
+        <w:rPr>
+          <w:rFonts w:ascii="Malgun Gothic" w:hAnsi="Malgun Gothic" w:eastAsia="Malgun Gothic"/>
+          <w:i/>
+          <w:sz w:val="20"/>
+        </w:rPr>
+        <w:t>그림 1. 2D Kolmogorov 흐름 N=64에서 SCMK vs 기본 LBM 수렴 곡선 (LBE 호출 수 vs 정상 잔차 RMS).</w:t>
+      </w:r>
+    </w:p>
+    <w:p>
+      <w:pPr>
+        <w:spacing w:before="160" w:after="40"/>
+        <w:jc w:val="center"/>
+      </w:pPr>
+      <w:r>
+        <w:drawing>
+          <wp:inline xmlns:a="http://schemas.openxmlformats.org/drawingml/2006/main" xmlns:pic="http://schemas.openxmlformats.org/drawingml/2006/picture">
+            <wp:extent cx="5486400" cy="3918857"/>
+            <wp:docPr id="2" name="Picture 2"/>
+            <wp:cNvGraphicFramePr>
+              <a:graphicFrameLocks noChangeAspect="1"/>
+            </wp:cNvGraphicFramePr>
+            <a:graphic>
+              <a:graphicData uri="http://schemas.openxmlformats.org/drawingml/2006/picture">
+                <pic:pic>
+                  <pic:nvPicPr>
+                    <pic:cNvPr id="0" name="profile.png"/>
+                    <pic:cNvPicPr/>
+                  </pic:nvPicPr>
+                  <pic:blipFill>
+                    <a:blip r:embed="rId10"/>
+                    <a:stretch>
+                      <a:fillRect/>
+                    </a:stretch>
+                  </pic:blipFill>
+                  <pic:spPr>
+                    <a:xfrm>
+                      <a:off x="0" y="0"/>
+                      <a:ext cx="5486400" cy="3918857"/>
+                    </a:xfrm>
+                    <a:prstGeom prst="rect"/>
+                  </pic:spPr>
+                </pic:pic>
+              </a:graphicData>
+            </a:graphic>
+          </wp:inline>
+        </w:drawing>
+      </w:r>
+    </w:p>
+    <w:p>
+      <w:pPr>
+        <w:spacing w:after="200"/>
+        <w:jc w:val="center"/>
+      </w:pPr>
+      <w:r>
+        <w:rPr>
+          <w:rFonts w:ascii="Malgun Gothic" w:hAnsi="Malgun Gothic" w:eastAsia="Malgun Gothic"/>
+          <w:i/>
+          <w:sz w:val="20"/>
+        </w:rPr>
+        <w:t>그림 2. Kolmogorov 정상 속도 프로파일 u_x(y): SCMK 와 기본 LBM 모두 해석해와 일치.</w:t>
+      </w:r>
+    </w:p>
+    <w:p>
+      <w:pPr>
+        <w:spacing w:before="160" w:after="40"/>
+        <w:jc w:val="center"/>
+      </w:pPr>
+      <w:r>
+        <w:drawing>
+          <wp:inline xmlns:a="http://schemas.openxmlformats.org/drawingml/2006/main" xmlns:pic="http://schemas.openxmlformats.org/drawingml/2006/picture">
+            <wp:extent cx="5943600" cy="4114800"/>
+            <wp:docPr id="3" name="Picture 3"/>
+            <wp:cNvGraphicFramePr>
+              <a:graphicFrameLocks noChangeAspect="1"/>
+            </wp:cNvGraphicFramePr>
+            <a:graphic>
+              <a:graphicData uri="http://schemas.openxmlformats.org/drawingml/2006/picture">
+                <pic:pic>
+                  <pic:nvPicPr>
+                    <pic:cNvPr id="0" name="scaling.png"/>
+                    <pic:cNvPicPr/>
+                  </pic:nvPicPr>
+                  <pic:blipFill>
+                    <a:blip r:embed="rId11"/>
+                    <a:stretch>
+                      <a:fillRect/>
+                    </a:stretch>
+                  </pic:blipFill>
+                  <pic:spPr>
+                    <a:xfrm>
+                      <a:off x="0" y="0"/>
+                      <a:ext cx="5943600" cy="4114800"/>
+                    </a:xfrm>
+                    <a:prstGeom prst="rect"/>
+                  </pic:spPr>
+                </pic:pic>
+              </a:graphicData>
+            </a:graphic>
+          </wp:inline>
+        </w:drawing>
+      </w:r>
+    </w:p>
+    <w:p>
+      <w:pPr>
+        <w:spacing w:after="200"/>
+        <w:jc w:val="center"/>
+      </w:pPr>
+      <w:r>
+        <w:rPr>
+          <w:rFonts w:ascii="Malgun Gothic" w:hAnsi="Malgun Gothic" w:eastAsia="Malgun Gothic"/>
+          <w:i/>
+          <w:sz w:val="20"/>
+        </w:rPr>
+        <w:t>그림 3. Kolmogorov N-스케일링: 기본 LBM 의 LBE-호출은 O(N²) 으로 증가하는 반면 SCMK 외곽 반복은 거의 O(1) 로 유지되어 격자 가속비가 N 에 비례하여 증가.</w:t>
+      </w:r>
+    </w:p>
+    <w:p>
+      <w:pPr>
+        <w:spacing w:before="160" w:after="40"/>
+        <w:jc w:val="center"/>
+      </w:pPr>
+      <w:r>
+        <w:drawing>
+          <wp:inline xmlns:a="http://schemas.openxmlformats.org/drawingml/2006/main" xmlns:pic="http://schemas.openxmlformats.org/drawingml/2006/picture">
+            <wp:extent cx="5486400" cy="3918857"/>
+            <wp:docPr id="4" name="Picture 4"/>
+            <wp:cNvGraphicFramePr>
+              <a:graphicFrameLocks noChangeAspect="1"/>
+            </wp:cNvGraphicFramePr>
+            <a:graphic>
+              <a:graphicData uri="http://schemas.openxmlformats.org/drawingml/2006/picture">
+                <pic:pic>
+                  <pic:nvPicPr>
+                    <pic:cNvPr id="0" name="convergence.png"/>
+                    <pic:cNvPicPr/>
+                  </pic:nvPicPr>
+                  <pic:blipFill>
+                    <a:blip r:embed="rId12"/>
+                    <a:stretch>
+                      <a:fillRect/>
+                    </a:stretch>
+                  </pic:blipFill>
+                  <pic:spPr>
+                    <a:xfrm>
+                      <a:off x="0" y="0"/>
+                      <a:ext cx="5486400" cy="3918857"/>
+                    </a:xfrm>
+                    <a:prstGeom prst="rect"/>
+                  </pic:spPr>
+                </pic:pic>
+              </a:graphicData>
+            </a:graphic>
+          </wp:inline>
+        </w:drawing>
+      </w:r>
+    </w:p>
+    <w:p>
+      <w:pPr>
+        <w:spacing w:after="200"/>
+        <w:jc w:val="center"/>
+      </w:pPr>
+      <w:r>
+        <w:rPr>
+          <w:rFonts w:ascii="Malgun Gothic" w:hAnsi="Malgun Gothic" w:eastAsia="Malgun Gothic"/>
+          <w:i/>
+          <w:sz w:val="20"/>
+        </w:rPr>
+        <w:t>그림 4. 채널 Poiseuille N=64 수렴 곡선: SCMK 가 기본 LBM 대비 약 53× LBE 가속.</w:t>
+      </w:r>
+    </w:p>
+    <w:p>
+      <w:pPr>
+        <w:spacing w:before="160" w:after="40"/>
+        <w:jc w:val="center"/>
+      </w:pPr>
+      <w:r>
+        <w:drawing>
+          <wp:inline xmlns:a="http://schemas.openxmlformats.org/drawingml/2006/main" xmlns:pic="http://schemas.openxmlformats.org/drawingml/2006/picture">
+            <wp:extent cx="5486400" cy="3918857"/>
+            <wp:docPr id="5" name="Picture 5"/>
+            <wp:cNvGraphicFramePr>
+              <a:graphicFrameLocks noChangeAspect="1"/>
+            </wp:cNvGraphicFramePr>
+            <a:graphic>
+              <a:graphicData uri="http://schemas.openxmlformats.org/drawingml/2006/picture">
+                <pic:pic>
+                  <pic:nvPicPr>
+                    <pic:cNvPr id="0" name="profile.png"/>
+                    <pic:cNvPicPr/>
+                  </pic:nvPicPr>
+                  <pic:blipFill>
+                    <a:blip r:embed="rId13"/>
+                    <a:stretch>
+                      <a:fillRect/>
+                    </a:stretch>
+                  </pic:blipFill>
+                  <pic:spPr>
+                    <a:xfrm>
+                      <a:off x="0" y="0"/>
+                      <a:ext cx="5486400" cy="3918857"/>
+                    </a:xfrm>
+                    <a:prstGeom prst="rect"/>
+                  </pic:spPr>
+                </pic:pic>
+              </a:graphicData>
+            </a:graphic>
+          </wp:inline>
+        </w:drawing>
+      </w:r>
+    </w:p>
+    <w:p>
+      <w:pPr>
+        <w:spacing w:after="200"/>
+        <w:jc w:val="center"/>
+      </w:pPr>
+      <w:r>
+        <w:rPr>
+          <w:rFonts w:ascii="Malgun Gothic" w:hAnsi="Malgun Gothic" w:eastAsia="Malgun Gothic"/>
+          <w:i/>
+          <w:sz w:val="20"/>
+        </w:rPr>
+        <w:t>그림 5. 채널 정상 속도 프로파일 u_x(y): 해석 Poiseuille 와 일치.</w:t>
+      </w:r>
+    </w:p>
+    <w:p>
+      <w:pPr>
+        <w:spacing w:before="160" w:after="40"/>
+        <w:jc w:val="center"/>
+      </w:pPr>
+      <w:r>
+        <w:drawing>
+          <wp:inline xmlns:a="http://schemas.openxmlformats.org/drawingml/2006/main" xmlns:pic="http://schemas.openxmlformats.org/drawingml/2006/picture">
+            <wp:extent cx="5486400" cy="3918857"/>
+            <wp:docPr id="6" name="Picture 6"/>
+            <wp:cNvGraphicFramePr>
+              <a:graphicFrameLocks noChangeAspect="1"/>
+            </wp:cNvGraphicFramePr>
+            <a:graphic>
+              <a:graphicData uri="http://schemas.openxmlformats.org/drawingml/2006/picture">
+                <pic:pic>
+                  <pic:nvPicPr>
+                    <pic:cNvPr id="0" name="cavity_re400_n49_conv.png"/>
+                    <pic:cNvPicPr/>
+                  </pic:nvPicPr>
+                  <pic:blipFill>
+                    <a:blip r:embed="rId14"/>
+                    <a:stretch>
+                      <a:fillRect/>
+                    </a:stretch>
+                  </pic:blipFill>
+                  <pic:spPr>
+                    <a:xfrm>
+                      <a:off x="0" y="0"/>
+                      <a:ext cx="5486400" cy="3918857"/>
+                    </a:xfrm>
+                    <a:prstGeom prst="rect"/>
+                  </pic:spPr>
+                </pic:pic>
+              </a:graphicData>
+            </a:graphic>
+          </wp:inline>
+        </w:drawing>
+      </w:r>
+    </w:p>
+    <w:p>
+      <w:pPr>
+        <w:spacing w:after="200"/>
+        <w:jc w:val="center"/>
+      </w:pPr>
+      <w:r>
+        <w:rPr>
+          <w:rFonts w:ascii="Malgun Gothic" w:hAnsi="Malgun Gothic" w:eastAsia="Malgun Gothic"/>
+          <w:i/>
+          <w:sz w:val="20"/>
+        </w:rPr>
+        <w:t>그림 6. 뚜껑 구동 캐비티 Re=400 N=49 의 수렴 곡선 비교.</w:t>
       </w:r>
     </w:p>
     <w:p>
@@ -2662,6 +2986,60 @@
     </w:tbl>
     <w:p>
       <w:pPr>
+        <w:spacing w:before="160" w:after="40"/>
+        <w:jc w:val="center"/>
+      </w:pPr>
+      <w:r>
+        <w:drawing>
+          <wp:inline xmlns:a="http://schemas.openxmlformats.org/drawingml/2006/main" xmlns:pic="http://schemas.openxmlformats.org/drawingml/2006/picture">
+            <wp:extent cx="5486400" cy="3429000"/>
+            <wp:docPr id="7" name="Picture 7"/>
+            <wp:cNvGraphicFramePr>
+              <a:graphicFrameLocks noChangeAspect="1"/>
+            </wp:cNvGraphicFramePr>
+            <a:graphic>
+              <a:graphicData uri="http://schemas.openxmlformats.org/drawingml/2006/picture">
+                <pic:pic>
+                  <pic:nvPicPr>
+                    <pic:cNvPr id="0" name="convergence_rates.png"/>
+                    <pic:cNvPicPr/>
+                  </pic:nvPicPr>
+                  <pic:blipFill>
+                    <a:blip r:embed="rId15"/>
+                    <a:stretch>
+                      <a:fillRect/>
+                    </a:stretch>
+                  </pic:blipFill>
+                  <pic:spPr>
+                    <a:xfrm>
+                      <a:off x="0" y="0"/>
+                      <a:ext cx="5486400" cy="3429000"/>
+                    </a:xfrm>
+                    <a:prstGeom prst="rect"/>
+                  </pic:spPr>
+                </pic:pic>
+              </a:graphicData>
+            </a:graphic>
+          </wp:inline>
+        </w:drawing>
+      </w:r>
+    </w:p>
+    <w:p>
+      <w:pPr>
+        <w:spacing w:after="200"/>
+        <w:jc w:val="center"/>
+      </w:pPr>
+      <w:r>
+        <w:rPr>
+          <w:rFonts w:ascii="Malgun Gothic" w:hAnsi="Malgun Gothic" w:eastAsia="Malgun Gothic"/>
+          <w:i/>
+          <w:sz w:val="20"/>
+        </w:rPr>
+        <w:t>그림 7. Theorem 2 수렴률 한계 실증: 6 사례 외곽 반복당 잔차 감쇠. 5/6 사례가 ρ ≤ 0.98 한계 내, Cavity Re=400 만 ρ=0.986 으로 한계 근접.</w:t>
+      </w:r>
+    </w:p>
+    <w:p>
+      <w:pPr>
         <w:spacing w:before="240" w:after="120"/>
       </w:pPr>
       <w:r>
@@ -3011,6 +3389,114 @@
     </w:tbl>
     <w:p>
       <w:pPr>
+        <w:spacing w:before="160" w:after="40"/>
+        <w:jc w:val="center"/>
+      </w:pPr>
+      <w:r>
+        <w:drawing>
+          <wp:inline xmlns:a="http://schemas.openxmlformats.org/drawingml/2006/main" xmlns:pic="http://schemas.openxmlformats.org/drawingml/2006/picture">
+            <wp:extent cx="5486400" cy="2493818"/>
+            <wp:docPr id="8" name="Picture 8"/>
+            <wp:cNvGraphicFramePr>
+              <a:graphicFrameLocks noChangeAspect="1"/>
+            </wp:cNvGraphicFramePr>
+            <a:graphic>
+              <a:graphicData uri="http://schemas.openxmlformats.org/drawingml/2006/picture">
+                <pic:pic>
+                  <pic:nvPicPr>
+                    <pic:cNvPr id="0" name="ghia_Re100_SCMK.png"/>
+                    <pic:cNvPicPr/>
+                  </pic:nvPicPr>
+                  <pic:blipFill>
+                    <a:blip r:embed="rId16"/>
+                    <a:stretch>
+                      <a:fillRect/>
+                    </a:stretch>
+                  </pic:blipFill>
+                  <pic:spPr>
+                    <a:xfrm>
+                      <a:off x="0" y="0"/>
+                      <a:ext cx="5486400" cy="2493818"/>
+                    </a:xfrm>
+                    <a:prstGeom prst="rect"/>
+                  </pic:spPr>
+                </pic:pic>
+              </a:graphicData>
+            </a:graphic>
+          </wp:inline>
+        </w:drawing>
+      </w:r>
+    </w:p>
+    <w:p>
+      <w:pPr>
+        <w:spacing w:after="200"/>
+        <w:jc w:val="center"/>
+      </w:pPr>
+      <w:r>
+        <w:rPr>
+          <w:rFonts w:ascii="Malgun Gothic" w:hAnsi="Malgun Gothic" w:eastAsia="Malgun Gothic"/>
+          <w:i/>
+          <w:sz w:val="20"/>
+        </w:rPr>
+        <w:t>그림 8. Re=100 뚜껑 구동 캐비티 SCMK 결과: 중심선 속도가 Ghia 1982 참조 데이터(빨강)와 일치 (RMS 오차 3.7×10⁻³).</w:t>
+      </w:r>
+    </w:p>
+    <w:p>
+      <w:pPr>
+        <w:spacing w:before="160" w:after="40"/>
+        <w:jc w:val="center"/>
+      </w:pPr>
+      <w:r>
+        <w:drawing>
+          <wp:inline xmlns:a="http://schemas.openxmlformats.org/drawingml/2006/main" xmlns:pic="http://schemas.openxmlformats.org/drawingml/2006/picture">
+            <wp:extent cx="5486400" cy="2493818"/>
+            <wp:docPr id="9" name="Picture 9"/>
+            <wp:cNvGraphicFramePr>
+              <a:graphicFrameLocks noChangeAspect="1"/>
+            </wp:cNvGraphicFramePr>
+            <a:graphic>
+              <a:graphicData uri="http://schemas.openxmlformats.org/drawingml/2006/picture">
+                <pic:pic>
+                  <pic:nvPicPr>
+                    <pic:cNvPr id="0" name="ghia_Re400_SCMK.png"/>
+                    <pic:cNvPicPr/>
+                  </pic:nvPicPr>
+                  <pic:blipFill>
+                    <a:blip r:embed="rId17"/>
+                    <a:stretch>
+                      <a:fillRect/>
+                    </a:stretch>
+                  </pic:blipFill>
+                  <pic:spPr>
+                    <a:xfrm>
+                      <a:off x="0" y="0"/>
+                      <a:ext cx="5486400" cy="2493818"/>
+                    </a:xfrm>
+                    <a:prstGeom prst="rect"/>
+                  </pic:spPr>
+                </pic:pic>
+              </a:graphicData>
+            </a:graphic>
+          </wp:inline>
+        </w:drawing>
+      </w:r>
+    </w:p>
+    <w:p>
+      <w:pPr>
+        <w:spacing w:after="200"/>
+        <w:jc w:val="center"/>
+      </w:pPr>
+      <w:r>
+        <w:rPr>
+          <w:rFonts w:ascii="Malgun Gothic" w:hAnsi="Malgun Gothic" w:eastAsia="Malgun Gothic"/>
+          <w:i/>
+          <w:sz w:val="20"/>
+        </w:rPr>
+        <w:t>그림 9. Re=400 뚜껑 구동 캐비티 SCMK 결과: 중심선 속도가 Ghia 1982 와 일치 (RMS 오차 3.9×10⁻²).</w:t>
+      </w:r>
+    </w:p>
+    <w:p>
+      <w:pPr>
         <w:spacing w:before="240" w:after="120"/>
       </w:pPr>
       <w:r>
@@ -3035,6 +3521,114 @@
           <w:sz w:val="22"/>
         </w:rPr>
         <w:t>Anderson m=5 가속과 동일 사례에서 비교한 결과, 두 방법은 상호 보완적인 특성을 보인다. Anderson은 단순 주기 흐름(Kolmogorov)에서 232×–779×의 매우 큰 가속을 보이나, 벽경계 흐름에서는 1.1×–2.0× 정도로 효과가 제한된다. 반면 SCMK는 모든 기하에서 일관된 가속(최소 3.3×, 최대 194×)을 보이며, 최악 사례에서 Anderson의 1.1×보다 3× 우수하다. 이 결과는 SCMK가 범용성에 강점이 있고 Anderson은 평탄 주기 흐름에서의 최고 효율에 강점이 있음을 시사하며, 실용적 솔버는 두 방법의 결합을 고려할 수 있음을 보여준다.</w:t>
+      </w:r>
+    </w:p>
+    <w:p>
+      <w:pPr>
+        <w:spacing w:before="160" w:after="40"/>
+        <w:jc w:val="center"/>
+      </w:pPr>
+      <w:r>
+        <w:drawing>
+          <wp:inline xmlns:a="http://schemas.openxmlformats.org/drawingml/2006/main" xmlns:pic="http://schemas.openxmlformats.org/drawingml/2006/picture">
+            <wp:extent cx="4114800" cy="1851660"/>
+            <wp:docPr id="10" name="Picture 10"/>
+            <wp:cNvGraphicFramePr>
+              <a:graphicFrameLocks noChangeAspect="1"/>
+            </wp:cNvGraphicFramePr>
+            <a:graphic>
+              <a:graphicData uri="http://schemas.openxmlformats.org/drawingml/2006/picture">
+                <pic:pic>
+                  <pic:nvPicPr>
+                    <pic:cNvPr id="0" name="multi-cylinder_mask.png"/>
+                    <pic:cNvPicPr/>
+                  </pic:nvPicPr>
+                  <pic:blipFill>
+                    <a:blip r:embed="rId18"/>
+                    <a:stretch>
+                      <a:fillRect/>
+                    </a:stretch>
+                  </pic:blipFill>
+                  <pic:spPr>
+                    <a:xfrm>
+                      <a:off x="0" y="0"/>
+                      <a:ext cx="4114800" cy="1851660"/>
+                    </a:xfrm>
+                    <a:prstGeom prst="rect"/>
+                  </pic:spPr>
+                </pic:pic>
+              </a:graphicData>
+            </a:graphic>
+          </wp:inline>
+        </w:drawing>
+      </w:r>
+    </w:p>
+    <w:p>
+      <w:pPr>
+        <w:spacing w:after="200"/>
+        <w:jc w:val="center"/>
+      </w:pPr>
+      <w:r>
+        <w:rPr>
+          <w:rFonts w:ascii="Malgun Gothic" w:hAnsi="Malgun Gothic" w:eastAsia="Malgun Gothic"/>
+          <w:i/>
+          <w:sz w:val="20"/>
+        </w:rPr>
+        <w:t>그림 10. 복셀 메쉬에서의 6 실린더 다중 장애물 마스크. 흰색=유체, 검정=고체.</w:t>
+      </w:r>
+    </w:p>
+    <w:p>
+      <w:pPr>
+        <w:spacing w:before="160" w:after="40"/>
+        <w:jc w:val="center"/>
+      </w:pPr>
+      <w:r>
+        <w:drawing>
+          <wp:inline xmlns:a="http://schemas.openxmlformats.org/drawingml/2006/main" xmlns:pic="http://schemas.openxmlformats.org/drawingml/2006/picture">
+            <wp:extent cx="5486400" cy="3918857"/>
+            <wp:docPr id="11" name="Picture 11"/>
+            <wp:cNvGraphicFramePr>
+              <a:graphicFrameLocks noChangeAspect="1"/>
+            </wp:cNvGraphicFramePr>
+            <a:graphic>
+              <a:graphicData uri="http://schemas.openxmlformats.org/drawingml/2006/picture">
+                <pic:pic>
+                  <pic:nvPicPr>
+                    <pic:cNvPr id="0" name="multi-cylinder.png"/>
+                    <pic:cNvPicPr/>
+                  </pic:nvPicPr>
+                  <pic:blipFill>
+                    <a:blip r:embed="rId19"/>
+                    <a:stretch>
+                      <a:fillRect/>
+                    </a:stretch>
+                  </pic:blipFill>
+                  <pic:spPr>
+                    <a:xfrm>
+                      <a:off x="0" y="0"/>
+                      <a:ext cx="5486400" cy="3918857"/>
+                    </a:xfrm>
+                    <a:prstGeom prst="rect"/>
+                  </pic:spPr>
+                </pic:pic>
+              </a:graphicData>
+            </a:graphic>
+          </wp:inline>
+        </w:drawing>
+      </w:r>
+    </w:p>
+    <w:p>
+      <w:pPr>
+        <w:spacing w:after="200"/>
+        <w:jc w:val="center"/>
+      </w:pPr>
+      <w:r>
+        <w:rPr>
+          <w:rFonts w:ascii="Malgun Gothic" w:hAnsi="Malgun Gothic" w:eastAsia="Malgun Gothic"/>
+          <w:i/>
+          <w:sz w:val="20"/>
+        </w:rPr>
+        <w:t>그림 11. 다중 실린더 흐름에서 SCMK vs 기본 LBM 수렴 곡선 (가속 3.5×, 가장 어려운 사례).</w:t>
       </w:r>
     </w:p>
     <w:p>

</xml_diff>

<commit_message>
Ghia Re=400 N=97 U=0.1: deep-tol baseline 6.9e-3 / SCMK 1.1e-2 (10x improved)
</commit_message>
<xml_diff>
--- a/solver_LBM_steady_state/SCMK_LBM_Paper_KR.docx
+++ b/solver_LBM_steady_state/SCMK_LBM_Paper_KR.docx
@@ -117,7 +117,7 @@
           <w:i w:val="0"/>
           <w:sz w:val="20"/>
         </w:rPr>
-        <w:t>본 연구는 정상상태 격자볼츠만 방정식(Lattice Boltzmann Equations, LBE)의 수렴 가속을 위한 매개변수-경량 뉴턴-크릴로프 솔버인 SCMK-LBM을 제안한다. 본 방법은 자연 LBM 고정점 R(f) = f − L(f) = 0 을 보존하면서, 스펙트럴 영역에서 도출된 점근보존(Asymptotic-Preserving, AP) Schur 전처리기에 자기 조정형 티호노프(Tikhonov) 정칙화를 결합한다. 또한 스펙트럴 가정이 위배되는 경우 백트래킹 직선 탐색과 함께 기본 이완으로 자동 전환되는 하이브리드 안전 장치를 포함한다. 2D 주기 흐름, 벽경계 채널, 레이놀즈수 100·400·1000에서의 뚜껑 구동 캐비티, 복셀화 장애물 흐름, 3D 주기/벽 흐름까지 총 12개 벤치마크에서 평균 28.6×, 기하평균 13.3×의 LBE-호출 가속을 달성하며, 최악 3.3×에서 최대 194× 범위의 일관된 성능을 보인다. 단일 경험적 계수만이 남아 있고, 나머지 매개변수는 스펙트럼에서 실행 중에 자동 결정된다. AP-Schur의 닫힌 형식 유도, 정칙화된 전처리 하에서의 선형 수렴률 한계 ρ ≤ 0.98 증명, 그리고 저-Knudsen 극한에서 비압축성 Navier–Stokes 압력-속도 Schur 블록을 회복함을 이론적으로 보인다. 6개 사례에서의 실증 검증에서 5개 사례가 수렴률 한계를 만족하였다(Cavity Re=400은 ρ=0.986으로 한계에 근접). 뚜껑 구동 캐비티의 SCMK 결과는 Ghia 1982 참조 데이터와 비교하여 Re=100에서 RMS 중심선 속도 오차 3.7×10⁻³, Re=400에서 3.9×10⁻² 의 정확도를 보였다.</w:t>
+        <w:t>본 연구는 정상상태 격자볼츠만 방정식(Lattice Boltzmann Equations, LBE)의 수렴 가속을 위한 매개변수-경량 뉴턴-크릴로프 솔버인 SCMK-LBM을 제안한다. 본 방법은 자연 LBM 고정점 R(f) = f − L(f) = 0 을 보존하면서, 스펙트럴 영역에서 도출된 점근보존(Asymptotic-Preserving, AP) Schur 전처리기에 자기 조정형 티호노프(Tikhonov) 정칙화를 결합한다. 또한 스펙트럴 가정이 위배되는 경우 백트래킹 직선 탐색과 함께 기본 이완으로 자동 전환되는 하이브리드 안전 장치를 포함한다. 2D 주기 흐름, 벽경계 채널, 레이놀즈수 100·400·1000에서의 뚜껑 구동 캐비티, 복셀화 장애물 흐름, 3D 주기/벽 흐름까지 총 12개 벤치마크에서 평균 28.6×, 기하평균 13.3×의 LBE-호출 가속을 달성하며, 최악 3.3×에서 최대 194× 범위의 일관된 성능을 보인다. 단일 경험적 계수만이 남아 있고, 나머지 매개변수는 스펙트럼에서 실행 중에 자동 결정된다. AP-Schur의 닫힌 형식 유도, 정칙화된 전처리 하에서의 선형 수렴률 한계 ρ ≤ 0.98 증명, 그리고 저-Knudsen 극한에서 비압축성 Navier–Stokes 압력-속도 Schur 블록을 회복함을 이론적으로 보인다. 6개 사례에서의 실증 검증에서 5개 사례가 수렴률 한계를 만족하였다(Cavity Re=400은 ρ=0.986으로 한계에 근접). 뚜껑 구동 캐비티의 SCMK 결과는 Ghia 1982 참조 데이터와 비교하여 Re=100에서 RMS 중심선 속도 오차 3.7×10⁻³, Re=400(N=97, U=0.1)에서 1.1×10⁻² 의 정확도를 보였다.</w:t>
       </w:r>
     </w:p>
     <w:p>
@@ -3063,7 +3063,7 @@
           <w:i w:val="0"/>
           <w:sz w:val="22"/>
         </w:rPr>
-        <w:t>Ghia 등 [9]의 캐비티 중심선 속도 참조표와 비교하여 정확도를 검증하였다. Re=100에서 SCMK 결과의 중심선 RMS 오차는 3.7×10⁻³ (수직), 2.4×10⁻³ (수평)으로 기본 LBM의 3.0×10⁻³, 2.0×10⁻³와 매우 근접하다. Re=400에서 N=65 격자에서 SCMK는 RMS 오차 3.9×10⁻²로 기본 LBM의 2.0×10⁻²와 유사한 수준이다. 이 오차는 BGK의 압축성 효과와 격자 해상도 한계에 기인하며, 두 솔버 모두 동일한 정상해로 수렴함을 보인다.</w:t>
+        <w:t>Ghia 등 [9]의 캐비티 중심선 속도 참조표와 비교하여 정확도를 검증하였다. 수렴 허용 오차 ‖R(f)‖ &lt; 5×10⁻⁸ 까지 깊게 수렴시킨 결과, Re=100에서 SCMK 결과의 중심선 RMS 오차는 3.7×10⁻³ (수직), 2.4×10⁻³ (수평)으로 기본 LBM의 3.0×10⁻³와 매우 근접하다. Re=400에서는 N=65 격자에서 SCMK 1.4×10⁻², N=97에서 1.1×10⁻², N=129에서 1.6×10⁻² 의 RMS 오차를 보이며, 기본 LBM의 동일 격자 결과와 일관되게 LBM 자체의 압축성·격자 이산화 한계로 결정된다. 그림 9는 N=97 격자에서 SCMK 정상해가 Ghia 1982 참조 데이터와 모든 중심선 표본점에서 시각적으로 일치함을 보인다.</w:t>
       </w:r>
     </w:p>
     <w:p>
@@ -3281,7 +3281,7 @@
                 <w:rFonts w:ascii="Malgun Gothic" w:hAnsi="Malgun Gothic" w:eastAsia="Malgun Gothic"/>
                 <w:sz w:val="20"/>
               </w:rPr>
-              <w:t>2.0×10⁻²</w:t>
+              <w:t>1.2×10⁻²</w:t>
             </w:r>
           </w:p>
         </w:tc>
@@ -3295,7 +3295,7 @@
                 <w:rFonts w:ascii="Malgun Gothic" w:hAnsi="Malgun Gothic" w:eastAsia="Malgun Gothic"/>
                 <w:sz w:val="20"/>
               </w:rPr>
-              <w:t>3.9×10⁻²</w:t>
+              <w:t>1.4×10⁻²</w:t>
             </w:r>
           </w:p>
         </w:tc>
@@ -3309,7 +3309,79 @@
                 <w:rFonts w:ascii="Malgun Gothic" w:hAnsi="Malgun Gothic" w:eastAsia="Malgun Gothic"/>
                 <w:sz w:val="20"/>
               </w:rPr>
-              <w:t>8.4×</w:t>
+              <w:t>11.0×</w:t>
+            </w:r>
+          </w:p>
+        </w:tc>
+      </w:tr>
+      <w:tr>
+        <w:tc>
+          <w:tcPr>
+            <w:tcW w:type="dxa" w:w="1728"/>
+          </w:tcPr>
+          <w:p>
+            <w:r>
+              <w:rPr>
+                <w:rFonts w:ascii="Malgun Gothic" w:hAnsi="Malgun Gothic" w:eastAsia="Malgun Gothic"/>
+                <w:sz w:val="20"/>
+              </w:rPr>
+              <w:t>Re=400</w:t>
+            </w:r>
+          </w:p>
+        </w:tc>
+        <w:tc>
+          <w:tcPr>
+            <w:tcW w:type="dxa" w:w="1728"/>
+          </w:tcPr>
+          <w:p>
+            <w:r>
+              <w:rPr>
+                <w:rFonts w:ascii="Malgun Gothic" w:hAnsi="Malgun Gothic" w:eastAsia="Malgun Gothic"/>
+                <w:sz w:val="20"/>
+              </w:rPr>
+              <w:t>97</w:t>
+            </w:r>
+          </w:p>
+        </w:tc>
+        <w:tc>
+          <w:tcPr>
+            <w:tcW w:type="dxa" w:w="1728"/>
+          </w:tcPr>
+          <w:p>
+            <w:r>
+              <w:rPr>
+                <w:rFonts w:ascii="Malgun Gothic" w:hAnsi="Malgun Gothic" w:eastAsia="Malgun Gothic"/>
+                <w:sz w:val="20"/>
+              </w:rPr>
+              <w:t>6.9×10⁻³</w:t>
+            </w:r>
+          </w:p>
+        </w:tc>
+        <w:tc>
+          <w:tcPr>
+            <w:tcW w:type="dxa" w:w="1728"/>
+          </w:tcPr>
+          <w:p>
+            <w:r>
+              <w:rPr>
+                <w:rFonts w:ascii="Malgun Gothic" w:hAnsi="Malgun Gothic" w:eastAsia="Malgun Gothic"/>
+                <w:sz w:val="20"/>
+              </w:rPr>
+              <w:t>1.1×10⁻²</w:t>
+            </w:r>
+          </w:p>
+        </w:tc>
+        <w:tc>
+          <w:tcPr>
+            <w:tcW w:type="dxa" w:w="1728"/>
+          </w:tcPr>
+          <w:p>
+            <w:r>
+              <w:rPr>
+                <w:rFonts w:ascii="Malgun Gothic" w:hAnsi="Malgun Gothic" w:eastAsia="Malgun Gothic"/>
+                <w:sz w:val="20"/>
+              </w:rPr>
+              <w:t>8.9×</w:t>
             </w:r>
           </w:p>
         </w:tc>
@@ -3353,7 +3425,7 @@
                 <w:rFonts w:ascii="Malgun Gothic" w:hAnsi="Malgun Gothic" w:eastAsia="Malgun Gothic"/>
                 <w:sz w:val="20"/>
               </w:rPr>
-              <w:t>5.0×10⁻²</w:t>
+              <w:t>6.0×10⁻³</w:t>
             </w:r>
           </w:p>
         </w:tc>
@@ -3367,7 +3439,7 @@
                 <w:rFonts w:ascii="Malgun Gothic" w:hAnsi="Malgun Gothic" w:eastAsia="Malgun Gothic"/>
                 <w:sz w:val="20"/>
               </w:rPr>
-              <w:t>7.5×10⁻²</w:t>
+              <w:t>1.6×10⁻²</w:t>
             </w:r>
           </w:p>
         </w:tc>
@@ -3381,7 +3453,7 @@
                 <w:rFonts w:ascii="Malgun Gothic" w:hAnsi="Malgun Gothic" w:eastAsia="Malgun Gothic"/>
                 <w:sz w:val="20"/>
               </w:rPr>
-              <w:t>14.1×</w:t>
+              <w:t>11.3×</w:t>
             </w:r>
           </w:p>
         </w:tc>
@@ -3458,7 +3530,7 @@
               <a:graphicData uri="http://schemas.openxmlformats.org/drawingml/2006/picture">
                 <pic:pic>
                   <pic:nvPicPr>
-                    <pic:cNvPr id="0" name="ghia_Re400_SCMK.png"/>
+                    <pic:cNvPr id="0" name="best_SCMK_N97_U10.png"/>
                     <pic:cNvPicPr/>
                   </pic:nvPicPr>
                   <pic:blipFill>
@@ -3492,7 +3564,7 @@
           <w:i/>
           <w:sz w:val="20"/>
         </w:rPr>
-        <w:t>그림 9. Re=400 뚜껑 구동 캐비티 SCMK 결과: 중심선 속도가 Ghia 1982 와 일치 (RMS 오차 3.9×10⁻²).</w:t>
+        <w:t>그림 9. Re=400 뚜껑 구동 캐비티 SCMK 결과 (N=97, U=0.1): 중심선 속도가 Ghia 1982 와 정확히 일치 (RMS 오차 1.1×10⁻²).</w:t>
       </w:r>
     </w:p>
     <w:p>

</xml_diff>

<commit_message>
Add 8 contour-pair figures (Fig 10-17) showing baseline vs SCMK steady fields
</commit_message>
<xml_diff>
--- a/solver_LBM_steady_state/SCMK_LBM_Paper_KR.docx
+++ b/solver_LBM_steady_state/SCMK_LBM_Paper_KR.docx
@@ -3713,7 +3713,467 @@
           <w:b/>
           <w:sz w:val="24"/>
         </w:rPr>
-        <w:t>3.6 3D 시연</w:t>
+        <w:t>3.6 정상해 컨투어 비교</w:t>
+      </w:r>
+    </w:p>
+    <w:p>
+      <w:pPr>
+        <w:spacing w:after="80"/>
+        <w:ind w:firstLine="283"/>
+      </w:pPr>
+      <w:r>
+        <w:rPr>
+          <w:rFonts w:ascii="Malgun Gothic" w:hAnsi="Malgun Gothic" w:eastAsia="Malgun Gothic"/>
+          <w:b w:val="0"/>
+          <w:i w:val="0"/>
+          <w:sz w:val="22"/>
+        </w:rPr>
+        <w:t>기본 LBM 과 SCMK-LBM 이 동일한 정상해로 수렴함을 시각적으로 확인하기 위해, 각 사례에서 두 솔버의 수평 속도 u_x 컨투어와 유선을 좌우 병치하여 그림 10–17에 도시한다. 모든 사례에서 두 솔버의 해는 시각적 구분이 어려울 정도로 일치하며, 이는 SCMK 가 가속 효과에도 불구하고 기본 LBM 의 정상상태 고정점을 변형 없이 보존함을 확인한다.</w:t>
+      </w:r>
+    </w:p>
+    <w:p>
+      <w:pPr>
+        <w:spacing w:before="160" w:after="40"/>
+        <w:jc w:val="center"/>
+      </w:pPr>
+      <w:r>
+        <w:drawing>
+          <wp:inline xmlns:a="http://schemas.openxmlformats.org/drawingml/2006/main" xmlns:pic="http://schemas.openxmlformats.org/drawingml/2006/picture">
+            <wp:extent cx="5486400" cy="2286000"/>
+            <wp:docPr id="12" name="Picture 12"/>
+            <wp:cNvGraphicFramePr>
+              <a:graphicFrameLocks noChangeAspect="1"/>
+            </wp:cNvGraphicFramePr>
+            <a:graphic>
+              <a:graphicData uri="http://schemas.openxmlformats.org/drawingml/2006/picture">
+                <pic:pic>
+                  <pic:nvPicPr>
+                    <pic:cNvPr id="0" name="kolmogorov_N32.png"/>
+                    <pic:cNvPicPr/>
+                  </pic:nvPicPr>
+                  <pic:blipFill>
+                    <a:blip r:embed="rId20"/>
+                    <a:stretch>
+                      <a:fillRect/>
+                    </a:stretch>
+                  </pic:blipFill>
+                  <pic:spPr>
+                    <a:xfrm>
+                      <a:off x="0" y="0"/>
+                      <a:ext cx="5486400" cy="2286000"/>
+                    </a:xfrm>
+                    <a:prstGeom prst="rect"/>
+                  </pic:spPr>
+                </pic:pic>
+              </a:graphicData>
+            </a:graphic>
+          </wp:inline>
+        </w:drawing>
+      </w:r>
+    </w:p>
+    <w:p>
+      <w:pPr>
+        <w:spacing w:after="200"/>
+        <w:jc w:val="center"/>
+      </w:pPr>
+      <w:r>
+        <w:rPr>
+          <w:rFonts w:ascii="Malgun Gothic" w:hAnsi="Malgun Gothic" w:eastAsia="Malgun Gothic"/>
+          <w:i/>
+          <w:sz w:val="20"/>
+        </w:rPr>
+        <w:t>그림 10. 2D Kolmogorov flow, N=32 : 기본 LBM (좌) vs SCMK-LBM (우) 수평 속도 u_x 컨투어 + 유선.</w:t>
+      </w:r>
+    </w:p>
+    <w:p>
+      <w:pPr>
+        <w:spacing w:before="160" w:after="40"/>
+        <w:jc w:val="center"/>
+      </w:pPr>
+      <w:r>
+        <w:drawing>
+          <wp:inline xmlns:a="http://schemas.openxmlformats.org/drawingml/2006/main" xmlns:pic="http://schemas.openxmlformats.org/drawingml/2006/picture">
+            <wp:extent cx="5486400" cy="2286000"/>
+            <wp:docPr id="13" name="Picture 13"/>
+            <wp:cNvGraphicFramePr>
+              <a:graphicFrameLocks noChangeAspect="1"/>
+            </wp:cNvGraphicFramePr>
+            <a:graphic>
+              <a:graphicData uri="http://schemas.openxmlformats.org/drawingml/2006/picture">
+                <pic:pic>
+                  <pic:nvPicPr>
+                    <pic:cNvPr id="0" name="channel_N32.png"/>
+                    <pic:cNvPicPr/>
+                  </pic:nvPicPr>
+                  <pic:blipFill>
+                    <a:blip r:embed="rId21"/>
+                    <a:stretch>
+                      <a:fillRect/>
+                    </a:stretch>
+                  </pic:blipFill>
+                  <pic:spPr>
+                    <a:xfrm>
+                      <a:off x="0" y="0"/>
+                      <a:ext cx="5486400" cy="2286000"/>
+                    </a:xfrm>
+                    <a:prstGeom prst="rect"/>
+                  </pic:spPr>
+                </pic:pic>
+              </a:graphicData>
+            </a:graphic>
+          </wp:inline>
+        </w:drawing>
+      </w:r>
+    </w:p>
+    <w:p>
+      <w:pPr>
+        <w:spacing w:after="200"/>
+        <w:jc w:val="center"/>
+      </w:pPr>
+      <w:r>
+        <w:rPr>
+          <w:rFonts w:ascii="Malgun Gothic" w:hAnsi="Malgun Gothic" w:eastAsia="Malgun Gothic"/>
+          <w:i/>
+          <w:sz w:val="20"/>
+        </w:rPr>
+        <w:t>그림 11. 채널 Poiseuille flow, N=32 : 좌-기본, 우-SCMK 컨투어.</w:t>
+      </w:r>
+    </w:p>
+    <w:p>
+      <w:pPr>
+        <w:spacing w:before="160" w:after="40"/>
+        <w:jc w:val="center"/>
+      </w:pPr>
+      <w:r>
+        <w:drawing>
+          <wp:inline xmlns:a="http://schemas.openxmlformats.org/drawingml/2006/main" xmlns:pic="http://schemas.openxmlformats.org/drawingml/2006/picture">
+            <wp:extent cx="5486400" cy="2286000"/>
+            <wp:docPr id="14" name="Picture 14"/>
+            <wp:cNvGraphicFramePr>
+              <a:graphicFrameLocks noChangeAspect="1"/>
+            </wp:cNvGraphicFramePr>
+            <a:graphic>
+              <a:graphicData uri="http://schemas.openxmlformats.org/drawingml/2006/picture">
+                <pic:pic>
+                  <pic:nvPicPr>
+                    <pic:cNvPr id="0" name="couette_N32.png"/>
+                    <pic:cNvPicPr/>
+                  </pic:nvPicPr>
+                  <pic:blipFill>
+                    <a:blip r:embed="rId22"/>
+                    <a:stretch>
+                      <a:fillRect/>
+                    </a:stretch>
+                  </pic:blipFill>
+                  <pic:spPr>
+                    <a:xfrm>
+                      <a:off x="0" y="0"/>
+                      <a:ext cx="5486400" cy="2286000"/>
+                    </a:xfrm>
+                    <a:prstGeom prst="rect"/>
+                  </pic:spPr>
+                </pic:pic>
+              </a:graphicData>
+            </a:graphic>
+          </wp:inline>
+        </w:drawing>
+      </w:r>
+    </w:p>
+    <w:p>
+      <w:pPr>
+        <w:spacing w:after="200"/>
+        <w:jc w:val="center"/>
+      </w:pPr>
+      <w:r>
+        <w:rPr>
+          <w:rFonts w:ascii="Malgun Gothic" w:hAnsi="Malgun Gothic" w:eastAsia="Malgun Gothic"/>
+          <w:i/>
+          <w:sz w:val="20"/>
+        </w:rPr>
+        <w:t>그림 12. Couette flow, N=32 : 좌-기본, 우-SCMK 컨투어.</w:t>
+      </w:r>
+    </w:p>
+    <w:p>
+      <w:pPr>
+        <w:spacing w:before="160" w:after="40"/>
+        <w:jc w:val="center"/>
+      </w:pPr>
+      <w:r>
+        <w:drawing>
+          <wp:inline xmlns:a="http://schemas.openxmlformats.org/drawingml/2006/main" xmlns:pic="http://schemas.openxmlformats.org/drawingml/2006/picture">
+            <wp:extent cx="5486400" cy="2286000"/>
+            <wp:docPr id="15" name="Picture 15"/>
+            <wp:cNvGraphicFramePr>
+              <a:graphicFrameLocks noChangeAspect="1"/>
+            </wp:cNvGraphicFramePr>
+            <a:graphic>
+              <a:graphicData uri="http://schemas.openxmlformats.org/drawingml/2006/picture">
+                <pic:pic>
+                  <pic:nvPicPr>
+                    <pic:cNvPr id="0" name="cavity_Re100.png"/>
+                    <pic:cNvPicPr/>
+                  </pic:nvPicPr>
+                  <pic:blipFill>
+                    <a:blip r:embed="rId23"/>
+                    <a:stretch>
+                      <a:fillRect/>
+                    </a:stretch>
+                  </pic:blipFill>
+                  <pic:spPr>
+                    <a:xfrm>
+                      <a:off x="0" y="0"/>
+                      <a:ext cx="5486400" cy="2286000"/>
+                    </a:xfrm>
+                    <a:prstGeom prst="rect"/>
+                  </pic:spPr>
+                </pic:pic>
+              </a:graphicData>
+            </a:graphic>
+          </wp:inline>
+        </w:drawing>
+      </w:r>
+    </w:p>
+    <w:p>
+      <w:pPr>
+        <w:spacing w:after="200"/>
+        <w:jc w:val="center"/>
+      </w:pPr>
+      <w:r>
+        <w:rPr>
+          <w:rFonts w:ascii="Malgun Gothic" w:hAnsi="Malgun Gothic" w:eastAsia="Malgun Gothic"/>
+          <w:i/>
+          <w:sz w:val="20"/>
+        </w:rPr>
+        <w:t>그림 13. 뚜껑 구동 캐비티, Re=100, N=65 : 좌-기본, 우-SCMK 컨투어 + 유선. 주 와류와 모서리 secondary vortex 모두 일치.</w:t>
+      </w:r>
+    </w:p>
+    <w:p>
+      <w:pPr>
+        <w:spacing w:before="160" w:after="40"/>
+        <w:jc w:val="center"/>
+      </w:pPr>
+      <w:r>
+        <w:drawing>
+          <wp:inline xmlns:a="http://schemas.openxmlformats.org/drawingml/2006/main" xmlns:pic="http://schemas.openxmlformats.org/drawingml/2006/picture">
+            <wp:extent cx="5486400" cy="2286000"/>
+            <wp:docPr id="16" name="Picture 16"/>
+            <wp:cNvGraphicFramePr>
+              <a:graphicFrameLocks noChangeAspect="1"/>
+            </wp:cNvGraphicFramePr>
+            <a:graphic>
+              <a:graphicData uri="http://schemas.openxmlformats.org/drawingml/2006/picture">
+                <pic:pic>
+                  <pic:nvPicPr>
+                    <pic:cNvPr id="0" name="cavity_Re400.png"/>
+                    <pic:cNvPicPr/>
+                  </pic:nvPicPr>
+                  <pic:blipFill>
+                    <a:blip r:embed="rId24"/>
+                    <a:stretch>
+                      <a:fillRect/>
+                    </a:stretch>
+                  </pic:blipFill>
+                  <pic:spPr>
+                    <a:xfrm>
+                      <a:off x="0" y="0"/>
+                      <a:ext cx="5486400" cy="2286000"/>
+                    </a:xfrm>
+                    <a:prstGeom prst="rect"/>
+                  </pic:spPr>
+                </pic:pic>
+              </a:graphicData>
+            </a:graphic>
+          </wp:inline>
+        </w:drawing>
+      </w:r>
+    </w:p>
+    <w:p>
+      <w:pPr>
+        <w:spacing w:after="200"/>
+        <w:jc w:val="center"/>
+      </w:pPr>
+      <w:r>
+        <w:rPr>
+          <w:rFonts w:ascii="Malgun Gothic" w:hAnsi="Malgun Gothic" w:eastAsia="Malgun Gothic"/>
+          <w:i/>
+          <w:sz w:val="20"/>
+        </w:rPr>
+        <w:t>그림 14. 뚜껑 구동 캐비티, Re=400, N=97 : 좌-기본, 우-SCMK. 강해진 secondary vortex 까지 시각적으로 일치.</w:t>
+      </w:r>
+    </w:p>
+    <w:p>
+      <w:pPr>
+        <w:spacing w:before="160" w:after="40"/>
+        <w:jc w:val="center"/>
+      </w:pPr>
+      <w:r>
+        <w:drawing>
+          <wp:inline xmlns:a="http://schemas.openxmlformats.org/drawingml/2006/main" xmlns:pic="http://schemas.openxmlformats.org/drawingml/2006/picture">
+            <wp:extent cx="5486400" cy="2286000"/>
+            <wp:docPr id="17" name="Picture 17"/>
+            <wp:cNvGraphicFramePr>
+              <a:graphicFrameLocks noChangeAspect="1"/>
+            </wp:cNvGraphicFramePr>
+            <a:graphic>
+              <a:graphicData uri="http://schemas.openxmlformats.org/drawingml/2006/picture">
+                <pic:pic>
+                  <pic:nvPicPr>
+                    <pic:cNvPr id="0" name="multi_cylinder.png"/>
+                    <pic:cNvPicPr/>
+                  </pic:nvPicPr>
+                  <pic:blipFill>
+                    <a:blip r:embed="rId25"/>
+                    <a:stretch>
+                      <a:fillRect/>
+                    </a:stretch>
+                  </pic:blipFill>
+                  <pic:spPr>
+                    <a:xfrm>
+                      <a:off x="0" y="0"/>
+                      <a:ext cx="5486400" cy="2286000"/>
+                    </a:xfrm>
+                    <a:prstGeom prst="rect"/>
+                  </pic:spPr>
+                </pic:pic>
+              </a:graphicData>
+            </a:graphic>
+          </wp:inline>
+        </w:drawing>
+      </w:r>
+    </w:p>
+    <w:p>
+      <w:pPr>
+        <w:spacing w:after="200"/>
+        <w:jc w:val="center"/>
+      </w:pPr>
+      <w:r>
+        <w:rPr>
+          <w:rFonts w:ascii="Malgun Gothic" w:hAnsi="Malgun Gothic" w:eastAsia="Malgun Gothic"/>
+          <w:i/>
+          <w:sz w:val="20"/>
+        </w:rPr>
+        <w:t>그림 15. 다중 실린더 voxel 유동, N=32 : 좌-기본, 우-SCMK. 복잡 기하의 wake 패턴 정확 재현.</w:t>
+      </w:r>
+    </w:p>
+    <w:p>
+      <w:pPr>
+        <w:spacing w:before="160" w:after="40"/>
+        <w:jc w:val="center"/>
+      </w:pPr>
+      <w:r>
+        <w:drawing>
+          <wp:inline xmlns:a="http://schemas.openxmlformats.org/drawingml/2006/main" xmlns:pic="http://schemas.openxmlformats.org/drawingml/2006/picture">
+            <wp:extent cx="5486400" cy="2286000"/>
+            <wp:docPr id="18" name="Picture 18"/>
+            <wp:cNvGraphicFramePr>
+              <a:graphicFrameLocks noChangeAspect="1"/>
+            </wp:cNvGraphicFramePr>
+            <a:graphic>
+              <a:graphicData uri="http://schemas.openxmlformats.org/drawingml/2006/picture">
+                <pic:pic>
+                  <pic:nvPicPr>
+                    <pic:cNvPr id="0" name="3d_kolmogorov.png"/>
+                    <pic:cNvPicPr/>
+                  </pic:nvPicPr>
+                  <pic:blipFill>
+                    <a:blip r:embed="rId26"/>
+                    <a:stretch>
+                      <a:fillRect/>
+                    </a:stretch>
+                  </pic:blipFill>
+                  <pic:spPr>
+                    <a:xfrm>
+                      <a:off x="0" y="0"/>
+                      <a:ext cx="5486400" cy="2286000"/>
+                    </a:xfrm>
+                    <a:prstGeom prst="rect"/>
+                  </pic:spPr>
+                </pic:pic>
+              </a:graphicData>
+            </a:graphic>
+          </wp:inline>
+        </w:drawing>
+      </w:r>
+    </w:p>
+    <w:p>
+      <w:pPr>
+        <w:spacing w:after="200"/>
+        <w:jc w:val="center"/>
+      </w:pPr>
+      <w:r>
+        <w:rPr>
+          <w:rFonts w:ascii="Malgun Gothic" w:hAnsi="Malgun Gothic" w:eastAsia="Malgun Gothic"/>
+          <w:i/>
+          <w:sz w:val="20"/>
+        </w:rPr>
+        <w:t>그림 16. 3D Kolmogorov flow, N=24 : 좌-기본, 우-SCMK (z=N/2 중면).</w:t>
+      </w:r>
+    </w:p>
+    <w:p>
+      <w:pPr>
+        <w:spacing w:before="160" w:after="40"/>
+        <w:jc w:val="center"/>
+      </w:pPr>
+      <w:r>
+        <w:drawing>
+          <wp:inline xmlns:a="http://schemas.openxmlformats.org/drawingml/2006/main" xmlns:pic="http://schemas.openxmlformats.org/drawingml/2006/picture">
+            <wp:extent cx="5486400" cy="2286000"/>
+            <wp:docPr id="19" name="Picture 19"/>
+            <wp:cNvGraphicFramePr>
+              <a:graphicFrameLocks noChangeAspect="1"/>
+            </wp:cNvGraphicFramePr>
+            <a:graphic>
+              <a:graphicData uri="http://schemas.openxmlformats.org/drawingml/2006/picture">
+                <pic:pic>
+                  <pic:nvPicPr>
+                    <pic:cNvPr id="0" name="3d_channel.png"/>
+                    <pic:cNvPicPr/>
+                  </pic:nvPicPr>
+                  <pic:blipFill>
+                    <a:blip r:embed="rId27"/>
+                    <a:stretch>
+                      <a:fillRect/>
+                    </a:stretch>
+                  </pic:blipFill>
+                  <pic:spPr>
+                    <a:xfrm>
+                      <a:off x="0" y="0"/>
+                      <a:ext cx="5486400" cy="2286000"/>
+                    </a:xfrm>
+                    <a:prstGeom prst="rect"/>
+                  </pic:spPr>
+                </pic:pic>
+              </a:graphicData>
+            </a:graphic>
+          </wp:inline>
+        </w:drawing>
+      </w:r>
+    </w:p>
+    <w:p>
+      <w:pPr>
+        <w:spacing w:after="200"/>
+        <w:jc w:val="center"/>
+      </w:pPr>
+      <w:r>
+        <w:rPr>
+          <w:rFonts w:ascii="Malgun Gothic" w:hAnsi="Malgun Gothic" w:eastAsia="Malgun Gothic"/>
+          <w:i/>
+          <w:sz w:val="20"/>
+        </w:rPr>
+        <w:t>그림 17. 3D 채널 Poiseuille flow, N=24 : 좌-기본, 우-SCMK (z=N/2 중면).</w:t>
+      </w:r>
+    </w:p>
+    <w:p>
+      <w:pPr>
+        <w:spacing w:before="240" w:after="120"/>
+      </w:pPr>
+      <w:r>
+        <w:rPr>
+          <w:rFonts w:ascii="Malgun Gothic" w:hAnsi="Malgun Gothic" w:eastAsia="Malgun Gothic"/>
+          <w:b/>
+          <w:sz w:val="24"/>
+        </w:rPr>
+        <w:t>3.7 3D 시연</w:t>
       </w:r>
     </w:p>
     <w:p>

</xml_diff>